<commit_message>
docs: tambah 5 diagram ke dokumen analisis + re-export DOCX
</commit_message>
<xml_diff>
--- a/docs/09-analisis-cv-rag.docx
+++ b/docs/09-analisis-cv-rag.docx
@@ -256,6 +256,123 @@
                     <a:xfrm>
                       <a:off x="0" y="0"/>
                       <a:ext cx="5029200" cy="3749782"/>
+                    </a:xfrm>
+                    <a:prstGeom prst="rect"/>
+                  </pic:spPr>
+                </pic:pic>
+              </a:graphicData>
+            </a:graphic>
+          </wp:inline>
+        </w:drawing>
+      </w:r>
+    </w:p>
+    <w:p>
+      <w:pPr>
+        <w:jc w:val="center"/>
+      </w:pPr>
+      <w:r>
+        <w:drawing>
+          <wp:inline xmlns:a="http://schemas.openxmlformats.org/drawingml/2006/main" xmlns:pic="http://schemas.openxmlformats.org/drawingml/2006/picture">
+            <wp:extent cx="5029200" cy="7934888"/>
+            <wp:docPr id="3" name="Picture 3"/>
+            <wp:cNvGraphicFramePr>
+              <a:graphicFrameLocks noChangeAspect="1"/>
+            </wp:cNvGraphicFramePr>
+            <a:graphic>
+              <a:graphicData uri="http://schemas.openxmlformats.org/drawingml/2006/picture">
+                <pic:pic>
+                  <pic:nvPicPr>
+                    <pic:cNvPr id="0" name="rag_flowchart.png"/>
+                    <pic:cNvPicPr/>
+                  </pic:nvPicPr>
+                  <pic:blipFill>
+                    <a:blip r:embed="rId11"/>
+                    <a:stretch>
+                      <a:fillRect/>
+                    </a:stretch>
+                  </pic:blipFill>
+                  <pic:spPr>
+                    <a:xfrm>
+                      <a:off x="0" y="0"/>
+                      <a:ext cx="5029200" cy="7934888"/>
+                    </a:xfrm>
+                    <a:prstGeom prst="rect"/>
+                  </pic:spPr>
+                </pic:pic>
+              </a:graphicData>
+            </a:graphic>
+          </wp:inline>
+        </w:drawing>
+      </w:r>
+    </w:p>
+    <w:p>
+      <w:pPr>
+        <w:jc w:val="center"/>
+      </w:pPr>
+      <w:r>
+        <w:drawing>
+          <wp:inline xmlns:a="http://schemas.openxmlformats.org/drawingml/2006/main" xmlns:pic="http://schemas.openxmlformats.org/drawingml/2006/picture">
+            <wp:extent cx="5029200" cy="770476"/>
+            <wp:docPr id="4" name="Picture 4"/>
+            <wp:cNvGraphicFramePr>
+              <a:graphicFrameLocks noChangeAspect="1"/>
+            </wp:cNvGraphicFramePr>
+            <a:graphic>
+              <a:graphicData uri="http://schemas.openxmlformats.org/drawingml/2006/picture">
+                <pic:pic>
+                  <pic:nvPicPr>
+                    <pic:cNvPr id="0" name="sequence_chat_rag.png"/>
+                    <pic:cNvPicPr/>
+                  </pic:nvPicPr>
+                  <pic:blipFill>
+                    <a:blip r:embed="rId12"/>
+                    <a:stretch>
+                      <a:fillRect/>
+                    </a:stretch>
+                  </pic:blipFill>
+                  <pic:spPr>
+                    <a:xfrm>
+                      <a:off x="0" y="0"/>
+                      <a:ext cx="5029200" cy="770476"/>
+                    </a:xfrm>
+                    <a:prstGeom prst="rect"/>
+                  </pic:spPr>
+                </pic:pic>
+              </a:graphicData>
+            </a:graphic>
+          </wp:inline>
+        </w:drawing>
+      </w:r>
+    </w:p>
+    <w:p>
+      <w:pPr>
+        <w:jc w:val="center"/>
+      </w:pPr>
+      <w:r>
+        <w:drawing>
+          <wp:inline xmlns:a="http://schemas.openxmlformats.org/drawingml/2006/main" xmlns:pic="http://schemas.openxmlformats.org/drawingml/2006/picture">
+            <wp:extent cx="5029200" cy="657549"/>
+            <wp:docPr id="5" name="Picture 5"/>
+            <wp:cNvGraphicFramePr>
+              <a:graphicFrameLocks noChangeAspect="1"/>
+            </wp:cNvGraphicFramePr>
+            <a:graphic>
+              <a:graphicData uri="http://schemas.openxmlformats.org/drawingml/2006/picture">
+                <pic:pic>
+                  <pic:nvPicPr>
+                    <pic:cNvPr id="0" name="sequence_analyze_cv.png"/>
+                    <pic:cNvPicPr/>
+                  </pic:nvPicPr>
+                  <pic:blipFill>
+                    <a:blip r:embed="rId13"/>
+                    <a:stretch>
+                      <a:fillRect/>
+                    </a:stretch>
+                  </pic:blipFill>
+                  <pic:spPr>
+                    <a:xfrm>
+                      <a:off x="0" y="0"/>
+                      <a:ext cx="5029200" cy="657549"/>
                     </a:xfrm>
                     <a:prstGeom prst="rect"/>
                   </pic:spPr>

</xml_diff>